<commit_message>
Update 별지5호/7호 to new official form across all templates
- 별지5호 희망수량표 단순화 (구분/3kW/스마트/키오스크 제거 → 3행)
- 별지5호 모집대행사에 활동내용 행 추가
- 별지7호 2번 수량 3kW·키오스크 행 제거 (3행으로 재구성)
- 별지7호 6번 제목 "(보조금을 받은 충전시설에 한함)" 삭제
- SDT id 갱신: 별지7호 7~11kW 483050426→-1335375053,
  별지5호 7~11kW 1751003065→390864121; 신규 11~30kW 필드는 공란 처리
- hec/nice/pluglink/sk/sk-invest 5개 템플릿 전부 반영

Co-Authored-By: Claude Opus 4.8 (1M context) <noreply@anthropic.com>
</commit_message>
<xml_diff>
--- a/public/nice/template.docx
+++ b/public/nice/template.docx
@@ -10707,6 +10707,95 @@
       </w:tr>
       <w:tr>
         <w:trPr>
+          <w:trHeight w:val="339"/>
+        </w:trPr>
+        <w:tc>
+          <w:tcPr>
+            <w:tcW w:w="1553" w:type="dxa"/>
+            <w:vMerge/>
+            <w:vAlign w:val="center"/>
+          </w:tcPr>
+          <w:p>
+            <w:pPr>
+              <w:jc w:val="center"/>
+              <w:rPr>
+                <w:sz w:val="18"/>
+                <w:szCs w:val="18"/>
+              </w:rPr>
+            </w:pPr>
+          </w:p>
+        </w:tc>
+        <w:tc>
+          <w:tcPr>
+            <w:tcW w:w="1554" w:type="dxa"/>
+            <w:vMerge/>
+            <w:vAlign w:val="center"/>
+          </w:tcPr>
+          <w:p>
+            <w:pPr>
+              <w:jc w:val="both"/>
+              <w:rPr>
+                <w:sz w:val="18"/>
+                <w:szCs w:val="18"/>
+              </w:rPr>
+            </w:pPr>
+          </w:p>
+        </w:tc>
+        <w:tc>
+          <w:tcPr>
+            <w:tcW w:w="1847" w:type="dxa"/>
+            <w:vMerge/>
+            <w:vAlign w:val="center"/>
+          </w:tcPr>
+          <w:p>
+            <w:pPr>
+              <w:jc w:val="both"/>
+              <w:rPr>
+                <w:sz w:val="18"/>
+                <w:szCs w:val="18"/>
+              </w:rPr>
+            </w:pPr>
+          </w:p>
+        </w:tc>
+        <w:tc>
+          <w:tcPr>
+            <w:tcW w:w="1704" w:type="dxa"/>
+            <w:vAlign w:val="center"/>
+          </w:tcPr>
+          <w:p>
+            <w:pPr>
+              <w:jc w:val="center"/>
+              <w:rPr>
+                <w:rStyle w:val="9pt"/>
+              </w:rPr>
+            </w:pPr>
+            <w:r>
+              <w:rPr>
+                <w:rStyle w:val="9pt"/>
+                <w:rFonts w:hint="eastAsia"/>
+              </w:rPr>
+              <w:t>활동내용</w:t>
+            </w:r>
+          </w:p>
+        </w:tc>
+        <w:tc>
+          <w:tcPr>
+            <w:tcW w:w="3798" w:type="dxa"/>
+            <w:gridSpan w:val="2"/>
+            <w:vAlign w:val="center"/>
+          </w:tcPr>
+          <w:p>
+            <w:pPr>
+              <w:jc w:val="center"/>
+              <w:rPr>
+                <w:rStyle w:val="9pt"/>
+              </w:rPr>
+            </w:pPr>
+          </w:p>
+        </w:tc>
+      </w:tr>
+      <w:tr>
+        <w:trPr>
           <w:trHeight w:val="598"/>
         </w:trPr>
         <w:tc>
@@ -11408,6 +11497,50 @@
         </w:tc>
       </w:tr>
       <w:tr>
+        <w:trPr>
+          <w:trHeight w:val="461"/>
+        </w:trPr>
+        <w:tc>
+          <w:tcPr>
+            <w:tcW w:w="1553" w:type="dxa"/>
+            <w:vMerge w:val="restart"/>
+            <w:vAlign w:val="center"/>
+          </w:tcPr>
+          <w:p>
+            <w:pPr>
+              <w:jc w:val="center"/>
+              <w:rPr>
+                <w:sz w:val="18"/>
+                <w:szCs w:val="18"/>
+              </w:rPr>
+            </w:pPr>
+            <w:r>
+              <w:rPr>
+                <w:rFonts w:hint="eastAsia"/>
+                <w:sz w:val="18"/>
+                <w:szCs w:val="18"/>
+              </w:rPr>
+              <w:t>설치수량</w:t>
+            </w:r>
+          </w:p>
+          <w:p>
+            <w:pPr>
+              <w:jc w:val="center"/>
+              <w:rPr>
+                <w:sz w:val="18"/>
+                <w:szCs w:val="18"/>
+              </w:rPr>
+            </w:pPr>
+            <w:r>
+              <w:rPr>
+                <w:rFonts w:hint="eastAsia"/>
+                <w:sz w:val="18"/>
+                <w:szCs w:val="18"/>
+              </w:rPr>
+              <w:t>및 요금</w:t>
+            </w:r>
+          </w:p>
+        </w:tc>
         <w:tc>
           <w:tcPr>
             <w:tcW w:w="1554" w:type="dxa"/>
@@ -11428,77 +11561,13 @@
                 <w:sz w:val="18"/>
                 <w:szCs w:val="18"/>
               </w:rPr>
-              <w:t>설치수량</w:t>
-            </w:r>
-          </w:p>
-          <w:p>
-            <w:pPr>
-              <w:jc w:val="center"/>
-              <w:rPr>
-                <w:sz w:val="18"/>
-                <w:szCs w:val="18"/>
-              </w:rPr>
-            </w:pPr>
-            <w:r>
-              <w:rPr>
-                <w:rFonts w:hint="eastAsia"/>
-                <w:sz w:val="18"/>
-                <w:szCs w:val="18"/>
-              </w:rPr>
-              <w:t>및 요금</w:t>
-            </w:r>
-          </w:p>
-        </w:tc>
-        <w:tc>
-          <w:tcPr>
-            <w:tcW w:w="1555" w:type="dxa"/>
-            <w:vMerge w:val="restart"/>
-            <w:vAlign w:val="center"/>
-          </w:tcPr>
-          <w:p>
-            <w:pPr>
-              <w:jc w:val="center"/>
-              <w:rPr>
-                <w:sz w:val="18"/>
-                <w:szCs w:val="18"/>
-              </w:rPr>
-            </w:pPr>
-            <w:r>
-              <w:rPr>
-                <w:rFonts w:hint="eastAsia"/>
-                <w:sz w:val="18"/>
-                <w:szCs w:val="18"/>
-              </w:rPr>
               <w:t>희망수량</w:t>
             </w:r>
           </w:p>
         </w:tc>
         <w:tc>
           <w:tcPr>
-            <w:tcW w:w="1847" w:type="dxa"/>
-            <w:vAlign w:val="center"/>
-          </w:tcPr>
-          <w:p>
-            <w:pPr>
-              <w:jc w:val="center"/>
-              <w:rPr>
-                <w:sz w:val="18"/>
-                <w:szCs w:val="18"/>
-              </w:rPr>
-            </w:pPr>
-            <w:r>
-              <w:rPr>
-                <w:rFonts w:hint="eastAsia"/>
-                <w:sz w:val="18"/>
-                <w:szCs w:val="18"/>
-              </w:rPr>
-              <w:t>구분</w:t>
-            </w:r>
-          </w:p>
-        </w:tc>
-        <w:tc>
-          <w:tcPr>
-            <w:tcW w:w="1643" w:type="dxa"/>
+            <w:tcW w:w="3551" w:type="dxa"/>
             <w:gridSpan w:val="2"/>
             <w:vAlign w:val="center"/>
           </w:tcPr>
@@ -11517,208 +11586,36 @@
                 <w:sz w:val="18"/>
                 <w:szCs w:val="18"/>
               </w:rPr>
-              <w:t>3kW 이상 ~</w:t>
-            </w:r>
-          </w:p>
+              <w:t>7kW 이상 ~</w:t>
+            </w:r>
+            <w:r>
+              <w:rPr>
+                <w:rFonts w:hint="eastAsia"/>
+                <w:sz w:val="18"/>
+                <w:szCs w:val="18"/>
+              </w:rPr>
+              <w:t xml:space="preserve"> </w:t>
+            </w:r>
+            <w:r>
+              <w:rPr>
+                <w:rFonts w:hint="eastAsia"/>
+                <w:sz w:val="18"/>
+                <w:szCs w:val="18"/>
+              </w:rPr>
+              <w:t>11kW 미만</w:t>
+            </w:r>
+          </w:p>
+        </w:tc>
+        <w:tc>
+          <w:tcPr>
+            <w:tcW w:w="3798" w:type="dxa"/>
+            <w:gridSpan w:val="2"/>
+            <w:vAlign w:val="center"/>
+          </w:tcPr>
           <w:p>
             <w:pPr>
               <w:spacing w:line="180" w:lineRule="auto"/>
               <w:jc w:val="center"/>
-              <w:rPr>
-                <w:sz w:val="18"/>
-                <w:szCs w:val="18"/>
-              </w:rPr>
-            </w:pPr>
-            <w:r>
-              <w:rPr>
-                <w:rFonts w:hint="eastAsia"/>
-                <w:sz w:val="18"/>
-                <w:szCs w:val="18"/>
-              </w:rPr>
-              <w:t>7kW 미만</w:t>
-            </w:r>
-          </w:p>
-        </w:tc>
-        <w:tc>
-          <w:tcPr>
-            <w:tcW w:w="1928" w:type="dxa"/>
-            <w:gridSpan w:val="3"/>
-            <w:vAlign w:val="center"/>
-          </w:tcPr>
-          <w:p>
-            <w:pPr>
-              <w:spacing w:line="180" w:lineRule="auto"/>
-              <w:jc w:val="center"/>
-              <w:rPr>
-                <w:sz w:val="18"/>
-                <w:szCs w:val="18"/>
-              </w:rPr>
-            </w:pPr>
-            <w:r>
-              <w:rPr>
-                <w:rFonts w:hint="eastAsia"/>
-                <w:sz w:val="18"/>
-                <w:szCs w:val="18"/>
-              </w:rPr>
-              <w:t>7kW 이상 ~</w:t>
-            </w:r>
-          </w:p>
-          <w:p>
-            <w:pPr>
-              <w:spacing w:line="180" w:lineRule="auto"/>
-              <w:jc w:val="center"/>
-              <w:rPr>
-                <w:sz w:val="18"/>
-                <w:szCs w:val="18"/>
-              </w:rPr>
-            </w:pPr>
-            <w:r>
-              <w:rPr>
-                <w:rFonts w:hint="eastAsia"/>
-                <w:sz w:val="18"/>
-                <w:szCs w:val="18"/>
-              </w:rPr>
-              <w:t>11kW 미만</w:t>
-            </w:r>
-          </w:p>
-        </w:tc>
-        <w:tc>
-          <w:tcPr>
-            <w:tcW w:w="1929" w:type="dxa"/>
-            <w:vAlign w:val="center"/>
-          </w:tcPr>
-          <w:p>
-            <w:pPr>
-              <w:spacing w:line="180" w:lineRule="auto"/>
-              <w:jc w:val="center"/>
-              <w:rPr>
-                <w:sz w:val="18"/>
-                <w:szCs w:val="18"/>
-              </w:rPr>
-            </w:pPr>
-            <w:r>
-              <w:rPr>
-                <w:rFonts w:hint="eastAsia"/>
-                <w:sz w:val="18"/>
-                <w:szCs w:val="18"/>
-              </w:rPr>
-              <w:t>11kW 이상 ~</w:t>
-            </w:r>
-          </w:p>
-          <w:p>
-            <w:pPr>
-              <w:spacing w:line="180" w:lineRule="auto"/>
-              <w:jc w:val="center"/>
-              <w:rPr>
-                <w:sz w:val="18"/>
-                <w:szCs w:val="18"/>
-              </w:rPr>
-            </w:pPr>
-            <w:r>
-              <w:rPr>
-                <w:rFonts w:hint="eastAsia"/>
-                <w:sz w:val="18"/>
-                <w:szCs w:val="18"/>
-              </w:rPr>
-              <w:t>30kW 미만</w:t>
-            </w:r>
-          </w:p>
-        </w:tc>
-      </w:tr>
-      <w:tr>
-        <w:trPr>
-          <w:trHeight w:val="349"/>
-        </w:trPr>
-        <w:tc>
-          <w:tcPr>
-            <w:tcW w:w="1554" w:type="dxa"/>
-            <w:vMerge/>
-            <w:vAlign w:val="center"/>
-          </w:tcPr>
-          <w:p>
-            <w:pPr>
-              <w:jc w:val="center"/>
-              <w:rPr>
-                <w:sz w:val="18"/>
-                <w:szCs w:val="18"/>
-              </w:rPr>
-            </w:pPr>
-          </w:p>
-        </w:tc>
-        <w:tc>
-          <w:tcPr>
-            <w:tcW w:w="1555" w:type="dxa"/>
-            <w:vMerge/>
-            <w:vAlign w:val="center"/>
-          </w:tcPr>
-          <w:p>
-            <w:pPr>
-              <w:jc w:val="center"/>
-              <w:rPr>
-                <w:sz w:val="18"/>
-                <w:szCs w:val="18"/>
-              </w:rPr>
-            </w:pPr>
-          </w:p>
-        </w:tc>
-        <w:tc>
-          <w:tcPr>
-            <w:tcW w:w="1847" w:type="dxa"/>
-            <w:vAlign w:val="center"/>
-          </w:tcPr>
-          <w:p>
-            <w:pPr>
-              <w:jc w:val="center"/>
-              <w:rPr>
-                <w:sz w:val="18"/>
-                <w:szCs w:val="18"/>
-              </w:rPr>
-            </w:pPr>
-            <w:r>
-              <w:rPr>
-                <w:rFonts w:hint="eastAsia"/>
-                <w:sz w:val="18"/>
-                <w:szCs w:val="18"/>
-              </w:rPr>
-              <w:t>스마트 충전기</w:t>
-            </w:r>
-          </w:p>
-        </w:tc>
-        <w:tc>
-          <w:tcPr>
-            <w:tcW w:w="1643" w:type="dxa"/>
-            <w:gridSpan w:val="2"/>
-            <w:vAlign w:val="center"/>
-          </w:tcPr>
-          <w:p>
-            <w:pPr>
-              <w:jc w:val="right"/>
-              <w:rPr>
-                <w:sz w:val="18"/>
-                <w:szCs w:val="18"/>
-              </w:rPr>
-            </w:pPr>
-            <w:r>
-              <w:rPr>
-                <w:rFonts w:hint="eastAsia"/>
-                <w:sz w:val="18"/>
-                <w:szCs w:val="18"/>
-              </w:rPr>
-              <w:t xml:space="preserve">기 </w:t>
-            </w:r>
-          </w:p>
-        </w:tc>
-        <w:bookmarkStart w:id="8" w:name="InstallQty2"/>
-        <w:bookmarkEnd w:id="8"/>
-        <w:tc>
-          <w:tcPr>
-            <w:tcW w:w="1928" w:type="dxa"/>
-            <w:gridSpan w:val="3"/>
-            <w:vAlign w:val="center"/>
-          </w:tcPr>
-          <w:p>
-            <w:pPr>
-              <w:jc w:val="right"/>
               <w:rPr>
                 <w:sz w:val="18"/>
                 <w:szCs w:val="18"/>
@@ -11730,9 +11627,9 @@
                   <w:rStyle w:val="9pt"/>
                   <w:rFonts w:hint="eastAsia"/>
                 </w:rPr>
-                <w:id w:val="1751003065"/>
+                <w:id w:val="390864121"/>
                 <w:placeholder>
-                  <w:docPart w:val="351CAB3454262F46A4936CD891704151"/>
+                  <w:docPart w:val="326D145E8DA867418952807BC9540AFC"/>
                 </w:placeholder>
                 <w:showingPlcHdr/>
                 <w:text/>
@@ -11775,18 +11672,57 @@
                 <w:sz w:val="18"/>
                 <w:szCs w:val="18"/>
               </w:rPr>
-              <w:t xml:space="preserve"> 기 </w:t>
-            </w:r>
-          </w:p>
-        </w:tc>
-        <w:tc>
-          <w:tcPr>
-            <w:tcW w:w="1929" w:type="dxa"/>
+              <w:t xml:space="preserve"> 기</w:t>
+            </w:r>
+          </w:p>
+        </w:tc>
+      </w:tr>
+      <w:tr>
+        <w:trPr>
+          <w:trHeight w:val="349"/>
+        </w:trPr>
+        <w:tc>
+          <w:tcPr>
+            <w:tcW w:w="1553" w:type="dxa"/>
+            <w:vMerge/>
             <w:vAlign w:val="center"/>
           </w:tcPr>
           <w:p>
             <w:pPr>
-              <w:jc w:val="right"/>
+              <w:jc w:val="center"/>
+              <w:rPr>
+                <w:sz w:val="18"/>
+                <w:szCs w:val="18"/>
+              </w:rPr>
+            </w:pPr>
+          </w:p>
+        </w:tc>
+        <w:tc>
+          <w:tcPr>
+            <w:tcW w:w="1554" w:type="dxa"/>
+            <w:vMerge/>
+            <w:vAlign w:val="center"/>
+          </w:tcPr>
+          <w:p>
+            <w:pPr>
+              <w:jc w:val="center"/>
+              <w:rPr>
+                <w:sz w:val="18"/>
+                <w:szCs w:val="18"/>
+              </w:rPr>
+            </w:pPr>
+          </w:p>
+        </w:tc>
+        <w:tc>
+          <w:tcPr>
+            <w:tcW w:w="3551" w:type="dxa"/>
+            <w:gridSpan w:val="2"/>
+            <w:vAlign w:val="center"/>
+          </w:tcPr>
+          <w:p>
+            <w:pPr>
+              <w:spacing w:line="180" w:lineRule="auto"/>
+              <w:jc w:val="center"/>
               <w:rPr>
                 <w:sz w:val="18"/>
                 <w:szCs w:val="18"/>
@@ -11798,7 +11734,95 @@
                 <w:sz w:val="18"/>
                 <w:szCs w:val="18"/>
               </w:rPr>
-              <w:t>기</w:t>
+              <w:t>11kW 이상 ~</w:t>
+            </w:r>
+            <w:r>
+              <w:rPr>
+                <w:rFonts w:hint="eastAsia"/>
+                <w:sz w:val="18"/>
+                <w:szCs w:val="18"/>
+              </w:rPr>
+              <w:t xml:space="preserve"> </w:t>
+            </w:r>
+            <w:r>
+              <w:rPr>
+                <w:rFonts w:hint="eastAsia"/>
+                <w:sz w:val="18"/>
+                <w:szCs w:val="18"/>
+              </w:rPr>
+              <w:t>30kW 미만</w:t>
+            </w:r>
+          </w:p>
+        </w:tc>
+        <w:bookmarkStart w:id="28" w:name="InstallQty2"/>
+        <w:bookmarkEnd w:id="28"/>
+        <w:tc>
+          <w:tcPr>
+            <w:tcW w:w="3798" w:type="dxa"/>
+            <w:gridSpan w:val="2"/>
+            <w:vAlign w:val="center"/>
+          </w:tcPr>
+          <w:p>
+            <w:pPr>
+              <w:jc w:val="center"/>
+              <w:rPr>
+                <w:rFonts w:hint="eastAsia"/>
+                <w:sz w:val="18"/>
+                <w:szCs w:val="18"/>
+              </w:rPr>
+            </w:pPr>
+            <w:sdt>
+              <w:sdtPr>
+                <w:rPr>
+                  <w:rStyle w:val="9pt"/>
+                  <w:rFonts w:hint="eastAsia"/>
+                </w:rPr>
+                <w:id w:val="1751003065"/>
+                <w:placeholder>
+                  <w:docPart w:val="7CF96C4D8F927649A96928F4DEE2EFB3"/>
+                </w:placeholder>
+                <w:showingPlcHdr/>
+                <w:text/>
+              </w:sdtPr>
+              <w:sdtEndPr>
+                <w:rPr>
+                  <w:rStyle w:val="a0"/>
+                  <w:rFonts w:eastAsia="맑은 고딕"/>
+                  <w:b w:val="0"/>
+                  <w:bCs/>
+                  <w:i/>
+                  <w:iCs/>
+                  <w:color w:val="A6A6A6" w:themeColor="background1" w:themeShade="A6"/>
+                  <w:sz w:val="16"/>
+                  <w:szCs w:val="16"/>
+                  <w:u w:val="single"/>
+                </w:rPr>
+              </w:sdtEndPr>
+              <w:sdtContent>
+                <w:r>
+                  <w:rPr>
+                    <w:rStyle w:val="a6"/>
+                    <w:rFonts w:hint="eastAsia"/>
+                    <w:b/>
+                    <w:bCs/>
+                    <w:i/>
+                    <w:iCs/>
+                    <w:color w:val="A6A6A6" w:themeColor="background1" w:themeShade="A6"/>
+                    <w:sz w:val="18"/>
+                    <w:szCs w:val="18"/>
+                    <w:u w:val="single"/>
+                  </w:rPr>
+                  <w:t xml:space="preserve">OO </w:t>
+                </w:r>
+              </w:sdtContent>
+            </w:sdt>
+            <w:r>
+              <w:rPr>
+                <w:rFonts w:hint="eastAsia"/>
+                <w:sz w:val="18"/>
+                <w:szCs w:val="18"/>
+              </w:rPr>
+              <w:t xml:space="preserve"> 기</w:t>
             </w:r>
           </w:p>
         </w:tc>
@@ -11809,6 +11833,22 @@
         </w:trPr>
         <w:tc>
           <w:tcPr>
+            <w:tcW w:w="1553" w:type="dxa"/>
+            <w:vMerge/>
+            <w:vAlign w:val="center"/>
+          </w:tcPr>
+          <w:p>
+            <w:pPr>
+              <w:jc w:val="center"/>
+              <w:rPr>
+                <w:sz w:val="18"/>
+                <w:szCs w:val="18"/>
+              </w:rPr>
+            </w:pPr>
+          </w:p>
+        </w:tc>
+        <w:tc>
+          <w:tcPr>
             <w:tcW w:w="1554" w:type="dxa"/>
             <w:vMerge/>
             <w:vAlign w:val="center"/>
@@ -11825,23 +11865,7 @@
         </w:tc>
         <w:tc>
           <w:tcPr>
-            <w:tcW w:w="1555" w:type="dxa"/>
-            <w:vMerge/>
-            <w:vAlign w:val="center"/>
-          </w:tcPr>
-          <w:p>
-            <w:pPr>
-              <w:jc w:val="center"/>
-              <w:rPr>
-                <w:sz w:val="18"/>
-                <w:szCs w:val="18"/>
-              </w:rPr>
-            </w:pPr>
-          </w:p>
-        </w:tc>
-        <w:tc>
-          <w:tcPr>
-            <w:tcW w:w="2449" w:type="dxa"/>
+            <w:tcW w:w="3551" w:type="dxa"/>
             <w:gridSpan w:val="2"/>
             <w:vAlign w:val="center"/>
           </w:tcPr>
@@ -11859,149 +11883,40 @@
                 <w:sz w:val="18"/>
                 <w:szCs w:val="18"/>
               </w:rPr>
-              <w:t>키오스크</w:t>
-            </w:r>
-          </w:p>
-        </w:tc>
-        <w:tc>
-          <w:tcPr>
-            <w:tcW w:w="2449" w:type="dxa"/>
-            <w:gridSpan w:val="3"/>
-            <w:vAlign w:val="center"/>
-          </w:tcPr>
-          <w:p>
-            <w:pPr>
-              <w:jc w:val="center"/>
-              <w:rPr>
-                <w:sz w:val="18"/>
-                <w:szCs w:val="18"/>
-              </w:rPr>
-            </w:pPr>
-            <w:r>
-              <w:rPr>
-                <w:rFonts w:hint="eastAsia"/>
-                <w:sz w:val="18"/>
-                <w:szCs w:val="18"/>
-              </w:rPr>
               <w:t>전력분배형</w:t>
             </w:r>
           </w:p>
         </w:tc>
         <w:tc>
           <w:tcPr>
-            <w:tcW w:w="2449" w:type="dxa"/>
+            <w:tcW w:w="3798" w:type="dxa"/>
             <w:gridSpan w:val="2"/>
             <w:vAlign w:val="center"/>
           </w:tcPr>
           <w:p>
             <w:pPr>
-              <w:jc w:val="both"/>
-              <w:rPr>
-                <w:sz w:val="18"/>
-                <w:szCs w:val="18"/>
-              </w:rPr>
-            </w:pPr>
-          </w:p>
-        </w:tc>
-      </w:tr>
-      <w:tr>
-        <w:trPr>
-          <w:trHeight w:val="277"/>
-        </w:trPr>
-        <w:tc>
-          <w:tcPr>
-            <w:tcW w:w="1554" w:type="dxa"/>
-            <w:vMerge/>
-            <w:vAlign w:val="center"/>
-          </w:tcPr>
-          <w:p>
-            <w:pPr>
               <w:jc w:val="center"/>
               <w:rPr>
                 <w:sz w:val="18"/>
                 <w:szCs w:val="18"/>
               </w:rPr>
             </w:pPr>
-          </w:p>
-        </w:tc>
-        <w:tc>
-          <w:tcPr>
-            <w:tcW w:w="1555" w:type="dxa"/>
-            <w:vMerge/>
-            <w:vAlign w:val="center"/>
-          </w:tcPr>
-          <w:p>
-            <w:pPr>
-              <w:jc w:val="center"/>
-              <w:rPr>
-                <w:sz w:val="18"/>
-                <w:szCs w:val="18"/>
-              </w:rPr>
-            </w:pPr>
-          </w:p>
-        </w:tc>
-        <w:tc>
-          <w:tcPr>
-            <w:tcW w:w="2449" w:type="dxa"/>
-            <w:gridSpan w:val="2"/>
-            <w:vAlign w:val="center"/>
-          </w:tcPr>
-          <w:p>
-            <w:pPr>
-              <w:jc w:val="right"/>
-              <w:rPr>
-                <w:sz w:val="18"/>
-                <w:szCs w:val="18"/>
-              </w:rPr>
-            </w:pPr>
             <w:r>
               <w:rPr>
                 <w:rFonts w:hint="eastAsia"/>
                 <w:sz w:val="18"/>
                 <w:szCs w:val="18"/>
               </w:rPr>
-              <w:t>기</w:t>
-            </w:r>
-          </w:p>
-        </w:tc>
-        <w:tc>
-          <w:tcPr>
-            <w:tcW w:w="2449" w:type="dxa"/>
-            <w:gridSpan w:val="3"/>
-            <w:vAlign w:val="center"/>
-          </w:tcPr>
-          <w:p>
-            <w:pPr>
-              <w:jc w:val="center"/>
-              <w:rPr>
-                <w:sz w:val="18"/>
-                <w:szCs w:val="18"/>
-              </w:rPr>
-            </w:pPr>
+              <w:t>kW    기(케이블     개</w:t>
+            </w:r>
             <w:r>
               <w:rPr>
                 <w:rFonts w:hint="eastAsia"/>
                 <w:sz w:val="18"/>
                 <w:szCs w:val="18"/>
               </w:rPr>
-              <w:t>kW    기(케이블     개)</w:t>
-            </w:r>
-          </w:p>
-        </w:tc>
-        <w:tc>
-          <w:tcPr>
-            <w:tcW w:w="2449" w:type="dxa"/>
-            <w:gridSpan w:val="2"/>
-            <w:vAlign w:val="center"/>
-          </w:tcPr>
-          <w:p>
-            <w:pPr>
-              <w:jc w:val="both"/>
-              <w:rPr>
-                <w:sz w:val="18"/>
-                <w:szCs w:val="18"/>
-              </w:rPr>
-            </w:pPr>
+              <w:t>)</w:t>
+            </w:r>
           </w:p>
         </w:tc>
       </w:tr>
@@ -14892,12 +14807,12 @@
       </w:tr>
       <w:tr>
         <w:trPr>
-          <w:trHeight w:val="764"/>
+          <w:trHeight w:val="516"/>
         </w:trPr>
         <w:tc>
           <w:tcPr>
-            <w:tcW w:w="1703" w:type="pct"/>
-            <w:gridSpan w:val="3"/>
+            <w:tcW w:w="2490" w:type="pct"/>
+            <w:gridSpan w:val="4"/>
             <w:tcBorders>
               <w:left w:val="single" w:sz="12" w:space="0" w:color="auto"/>
             </w:tcBorders>
@@ -14906,66 +14821,41 @@
             <w:pPr>
               <w:jc w:val="center"/>
               <w:rPr>
-                <w:rFonts w:asciiTheme="majorEastAsia" w:eastAsiaTheme="majorEastAsia" w:hAnsiTheme="majorEastAsia"/>
-              </w:rPr>
-            </w:pPr>
-            <w:r>
-              <w:rPr>
-                <w:rFonts w:asciiTheme="majorEastAsia" w:eastAsiaTheme="majorEastAsia" w:hAnsiTheme="majorEastAsia" w:hint="eastAsia"/>
-              </w:rPr>
-              <w:t>3kW 이상 ~ 7kW 미만</w:t>
-            </w:r>
-          </w:p>
+                <w:rFonts w:asciiTheme="majorHAnsi" w:eastAsiaTheme="majorHAnsi" w:hAnsiTheme="majorHAnsi" w:hint="eastAsia"/>
+              </w:rPr>
+            </w:pPr>
+            <w:r>
+              <w:rPr>
+                <w:rFonts w:asciiTheme="majorHAnsi" w:eastAsiaTheme="majorHAnsi" w:hAnsiTheme="majorHAnsi" w:hint="eastAsia"/>
+              </w:rPr>
+              <w:t>7kW 이상 ~ 11kW 미만</w:t>
+            </w:r>
+          </w:p>
+        </w:tc>
+        <w:tc>
+          <w:tcPr>
+            <w:tcW w:w="2510" w:type="pct"/>
+            <w:gridSpan w:val="5"/>
+            <w:tcBorders>
+              <w:right w:val="single" w:sz="12" w:space="0" w:color="auto"/>
+            </w:tcBorders>
+          </w:tcPr>
           <w:p>
             <w:pPr>
               <w:jc w:val="center"/>
               <w:rPr>
-                <w:rFonts w:asciiTheme="majorEastAsia" w:eastAsiaTheme="majorEastAsia" w:hAnsiTheme="majorEastAsia"/>
-              </w:rPr>
-            </w:pPr>
-            <w:r>
-              <w:rPr>
-                <w:rFonts w:asciiTheme="majorEastAsia" w:eastAsiaTheme="majorEastAsia" w:hAnsiTheme="majorEastAsia"/>
-              </w:rPr>
-              <w:t>(     )기</w:t>
-            </w:r>
-          </w:p>
-        </w:tc>
-        <w:tc>
-          <w:tcPr>
-            <w:tcW w:w="1570" w:type="pct"/>
-            <w:gridSpan w:val="3"/>
-          </w:tcPr>
-          <w:p>
-            <w:pPr>
-              <w:jc w:val="center"/>
-              <w:rPr>
-                <w:rFonts w:asciiTheme="majorEastAsia" w:eastAsiaTheme="majorEastAsia" w:hAnsiTheme="majorEastAsia"/>
-              </w:rPr>
-            </w:pPr>
-            <w:r>
-              <w:rPr>
-                <w:rFonts w:asciiTheme="majorEastAsia" w:eastAsiaTheme="majorEastAsia" w:hAnsiTheme="majorEastAsia" w:hint="eastAsia"/>
-              </w:rPr>
-              <w:t>7kW 이상 ~ 11kW 미만</w:t>
-            </w:r>
-          </w:p>
-          <w:p>
-            <w:pPr>
-              <w:jc w:val="center"/>
-              <w:rPr>
-                <w:rFonts w:asciiTheme="majorEastAsia" w:eastAsiaTheme="majorEastAsia" w:hAnsiTheme="majorEastAsia"/>
-              </w:rPr>
-            </w:pPr>
-            <w:r>
-              <w:rPr>
-                <w:rFonts w:asciiTheme="majorEastAsia" w:eastAsiaTheme="majorEastAsia" w:hAnsiTheme="majorEastAsia"/>
+                <w:rFonts w:asciiTheme="majorHAnsi" w:eastAsiaTheme="majorHAnsi" w:hAnsiTheme="majorHAnsi"/>
+              </w:rPr>
+            </w:pPr>
+            <w:r>
+              <w:rPr>
+                <w:rFonts w:asciiTheme="majorHAnsi" w:eastAsiaTheme="majorHAnsi" w:hAnsiTheme="majorHAnsi"/>
               </w:rPr>
               <w:t>(</w:t>
             </w:r>
             <w:r>
               <w:rPr>
-                <w:rFonts w:asciiTheme="majorEastAsia" w:eastAsiaTheme="majorEastAsia" w:hAnsiTheme="majorEastAsia" w:hint="eastAsia"/>
+                <w:rFonts w:asciiTheme="majorHAnsi" w:eastAsiaTheme="majorHAnsi" w:hAnsiTheme="majorHAnsi" w:hint="eastAsia"/>
               </w:rPr>
               <w:t xml:space="preserve">  </w:t>
             </w:r>
@@ -14973,11 +14863,11 @@
               <w:sdtPr>
                 <w:rPr>
                   <w:rStyle w:val="10pt"/>
-                  <w:rFonts w:asciiTheme="majorEastAsia" w:hAnsiTheme="majorEastAsia" w:hint="eastAsia"/>
+                  <w:rFonts w:hint="eastAsia"/>
                 </w:rPr>
-                <w:id w:val="483050426"/>
+                <w:id w:val="-1335375053"/>
                 <w:placeholder>
-                  <w:docPart w:val="3E5B4AC00DD55949B06608876698257B"/>
+                  <w:docPart w:val="1CAD5D37B74AA74D9D39C4ED7B27E881"/>
                 </w:placeholder>
                 <w:showingPlcHdr/>
                 <w:text/>
@@ -14998,7 +14888,7 @@
                 <w:r>
                   <w:rPr>
                     <w:rStyle w:val="a6"/>
-                    <w:rFonts w:asciiTheme="majorEastAsia" w:eastAsiaTheme="majorEastAsia" w:hAnsiTheme="majorEastAsia" w:hint="eastAsia"/>
+                    <w:rFonts w:hint="eastAsia"/>
                     <w:b/>
                     <w:bCs/>
                     <w:i/>
@@ -15012,63 +14902,26 @@
             </w:sdt>
             <w:r>
               <w:rPr>
-                <w:rFonts w:asciiTheme="majorEastAsia" w:eastAsiaTheme="majorEastAsia" w:hAnsiTheme="majorEastAsia" w:hint="eastAsia"/>
-              </w:rPr>
-              <w:t xml:space="preserve"> </w:t>
-            </w:r>
-            <w:r>
-              <w:rPr>
-                <w:rFonts w:asciiTheme="majorEastAsia" w:eastAsiaTheme="majorEastAsia" w:hAnsiTheme="majorEastAsia"/>
+                <w:rFonts w:asciiTheme="majorHAnsi" w:eastAsiaTheme="majorHAnsi" w:hAnsiTheme="majorHAnsi" w:hint="eastAsia"/>
+              </w:rPr>
+              <w:t xml:space="preserve"> </w:t>
+            </w:r>
+            <w:r>
+              <w:rPr>
+                <w:rFonts w:asciiTheme="majorHAnsi" w:eastAsiaTheme="majorHAnsi" w:hAnsiTheme="majorHAnsi"/>
               </w:rPr>
               <w:t>)기</w:t>
-            </w:r>
-          </w:p>
-        </w:tc>
-        <w:tc>
-          <w:tcPr>
-            <w:tcW w:w="1727" w:type="pct"/>
-            <w:gridSpan w:val="3"/>
-            <w:tcBorders>
-              <w:right w:val="single" w:sz="12" w:space="0" w:color="auto"/>
-            </w:tcBorders>
-          </w:tcPr>
-          <w:p>
-            <w:pPr>
-              <w:jc w:val="center"/>
-              <w:rPr>
-                <w:rFonts w:asciiTheme="majorEastAsia" w:eastAsiaTheme="majorEastAsia" w:hAnsiTheme="majorEastAsia"/>
-              </w:rPr>
-            </w:pPr>
-            <w:r>
-              <w:rPr>
-                <w:rFonts w:asciiTheme="majorEastAsia" w:eastAsiaTheme="majorEastAsia" w:hAnsiTheme="majorEastAsia" w:hint="eastAsia"/>
-              </w:rPr>
-              <w:t>11kW 이상 ~ 30kW 미만</w:t>
-            </w:r>
-          </w:p>
-          <w:p>
-            <w:pPr>
-              <w:jc w:val="center"/>
-              <w:rPr>
-                <w:rFonts w:asciiTheme="majorEastAsia" w:eastAsiaTheme="majorEastAsia" w:hAnsiTheme="majorEastAsia"/>
-              </w:rPr>
-            </w:pPr>
-            <w:r>
-              <w:rPr>
-                <w:rFonts w:asciiTheme="majorEastAsia" w:eastAsiaTheme="majorEastAsia" w:hAnsiTheme="majorEastAsia"/>
-              </w:rPr>
-              <w:t>(     )기</w:t>
             </w:r>
           </w:p>
         </w:tc>
       </w:tr>
       <w:tr>
         <w:trPr>
-          <w:trHeight w:val="764"/>
+          <w:trHeight w:val="566"/>
         </w:trPr>
         <w:tc>
           <w:tcPr>
-            <w:tcW w:w="2488" w:type="pct"/>
+            <w:tcW w:w="2490" w:type="pct"/>
             <w:gridSpan w:val="4"/>
             <w:tcBorders>
               <w:left w:val="single" w:sz="12" w:space="0" w:color="auto"/>
@@ -15078,34 +14931,20 @@
             <w:pPr>
               <w:jc w:val="center"/>
               <w:rPr>
-                <w:rFonts w:asciiTheme="majorEastAsia" w:eastAsiaTheme="majorEastAsia" w:hAnsiTheme="majorEastAsia"/>
-              </w:rPr>
-            </w:pPr>
-            <w:r>
-              <w:rPr>
-                <w:rFonts w:asciiTheme="majorEastAsia" w:eastAsiaTheme="majorEastAsia" w:hAnsiTheme="majorEastAsia" w:hint="eastAsia"/>
-              </w:rPr>
-              <w:t>키오스크 충전기</w:t>
-            </w:r>
-          </w:p>
-          <w:p>
-            <w:pPr>
-              <w:jc w:val="center"/>
-              <w:rPr>
-                <w:rFonts w:asciiTheme="majorEastAsia" w:eastAsiaTheme="majorEastAsia" w:hAnsiTheme="majorEastAsia"/>
-              </w:rPr>
-            </w:pPr>
-            <w:r>
-              <w:rPr>
-                <w:rFonts w:asciiTheme="majorEastAsia" w:eastAsiaTheme="majorEastAsia" w:hAnsiTheme="majorEastAsia"/>
-              </w:rPr>
-              <w:t>(     )기</w:t>
-            </w:r>
-          </w:p>
-        </w:tc>
-        <w:tc>
-          <w:tcPr>
-            <w:tcW w:w="2512" w:type="pct"/>
+                <w:rFonts w:asciiTheme="majorHAnsi" w:eastAsiaTheme="majorHAnsi" w:hAnsiTheme="majorHAnsi" w:hint="eastAsia"/>
+              </w:rPr>
+            </w:pPr>
+            <w:r>
+              <w:rPr>
+                <w:rFonts w:asciiTheme="majorHAnsi" w:eastAsiaTheme="majorHAnsi" w:hAnsiTheme="majorHAnsi" w:hint="eastAsia"/>
+              </w:rPr>
+              <w:t>11kW 이상 ~ 30kW 미만</w:t>
+            </w:r>
+          </w:p>
+        </w:tc>
+        <w:tc>
+          <w:tcPr>
+            <w:tcW w:w="2510" w:type="pct"/>
             <w:gridSpan w:val="5"/>
             <w:tcBorders>
               <w:right w:val="single" w:sz="12" w:space="0" w:color="auto"/>
@@ -15115,26 +14954,122 @@
             <w:pPr>
               <w:jc w:val="center"/>
               <w:rPr>
-                <w:rFonts w:asciiTheme="majorEastAsia" w:eastAsiaTheme="majorEastAsia" w:hAnsiTheme="majorEastAsia"/>
-              </w:rPr>
-            </w:pPr>
-            <w:r>
-              <w:rPr>
-                <w:rFonts w:asciiTheme="majorEastAsia" w:eastAsiaTheme="majorEastAsia" w:hAnsiTheme="majorEastAsia" w:hint="eastAsia"/>
+                <w:rFonts w:asciiTheme="majorHAnsi" w:eastAsiaTheme="majorHAnsi" w:hAnsiTheme="majorHAnsi"/>
+              </w:rPr>
+            </w:pPr>
+            <w:r>
+              <w:rPr>
+                <w:rFonts w:asciiTheme="majorHAnsi" w:eastAsiaTheme="majorHAnsi" w:hAnsiTheme="majorHAnsi"/>
+              </w:rPr>
+              <w:t>(</w:t>
+            </w:r>
+            <w:r>
+              <w:rPr>
+                <w:rFonts w:asciiTheme="majorHAnsi" w:eastAsiaTheme="majorHAnsi" w:hAnsiTheme="majorHAnsi" w:hint="eastAsia"/>
+              </w:rPr>
+              <w:t xml:space="preserve">  </w:t>
+            </w:r>
+            <w:sdt>
+              <w:sdtPr>
+                <w:rPr>
+                  <w:rStyle w:val="10pt"/>
+                  <w:rFonts w:hint="eastAsia"/>
+                </w:rPr>
+                <w:id w:val="313466420"/>
+                <w:placeholder>
+                  <w:docPart w:val="ED93C1928DBA2B4AB78D22611A942B6D"/>
+                </w:placeholder>
+                <w:showingPlcHdr/>
+                <w:text/>
+              </w:sdtPr>
+              <w:sdtEndPr>
+                <w:rPr>
+                  <w:rStyle w:val="a0"/>
+                  <w:rFonts w:eastAsia="맑은 고딕"/>
+                  <w:b w:val="0"/>
+                  <w:bCs/>
+                  <w:i/>
+                  <w:iCs/>
+                  <w:color w:val="A6A6A6" w:themeColor="background1" w:themeShade="A6"/>
+                  <w:u w:val="single"/>
+                </w:rPr>
+              </w:sdtEndPr>
+              <w:sdtContent>
+                <w:r>
+                  <w:rPr>
+                    <w:rStyle w:val="a6"/>
+                    <w:rFonts w:hint="eastAsia"/>
+                    <w:b/>
+                    <w:bCs/>
+                    <w:i/>
+                    <w:iCs/>
+                    <w:color w:val="A6A6A6" w:themeColor="background1" w:themeShade="A6"/>
+                    <w:u w:val="single"/>
+                  </w:rPr>
+                  <w:t xml:space="preserve">OO </w:t>
+                </w:r>
+              </w:sdtContent>
+            </w:sdt>
+            <w:r>
+              <w:rPr>
+                <w:rFonts w:asciiTheme="majorHAnsi" w:eastAsiaTheme="majorHAnsi" w:hAnsiTheme="majorHAnsi" w:hint="eastAsia"/>
+              </w:rPr>
+              <w:t xml:space="preserve"> </w:t>
+            </w:r>
+            <w:r>
+              <w:rPr>
+                <w:rFonts w:asciiTheme="majorHAnsi" w:eastAsiaTheme="majorHAnsi" w:hAnsiTheme="majorHAnsi"/>
+              </w:rPr>
+              <w:t>)기</w:t>
+            </w:r>
+          </w:p>
+        </w:tc>
+      </w:tr>
+      <w:tr>
+        <w:trPr>
+          <w:trHeight w:val="559"/>
+        </w:trPr>
+        <w:tc>
+          <w:tcPr>
+            <w:tcW w:w="2490" w:type="pct"/>
+            <w:gridSpan w:val="4"/>
+            <w:tcBorders>
+              <w:left w:val="single" w:sz="12" w:space="0" w:color="auto"/>
+            </w:tcBorders>
+          </w:tcPr>
+          <w:p>
+            <w:pPr>
+              <w:jc w:val="center"/>
+              <w:rPr>
+                <w:rFonts w:asciiTheme="majorHAnsi" w:eastAsiaTheme="majorHAnsi" w:hAnsiTheme="majorHAnsi" w:hint="eastAsia"/>
+              </w:rPr>
+            </w:pPr>
+            <w:r>
+              <w:rPr>
+                <w:rFonts w:asciiTheme="majorHAnsi" w:eastAsiaTheme="majorHAnsi" w:hAnsiTheme="majorHAnsi" w:hint="eastAsia"/>
               </w:rPr>
               <w:t>전력분배형 충전기</w:t>
             </w:r>
           </w:p>
+        </w:tc>
+        <w:tc>
+          <w:tcPr>
+            <w:tcW w:w="2510" w:type="pct"/>
+            <w:gridSpan w:val="5"/>
+            <w:tcBorders>
+              <w:right w:val="single" w:sz="12" w:space="0" w:color="auto"/>
+            </w:tcBorders>
+          </w:tcPr>
           <w:p>
             <w:pPr>
               <w:jc w:val="center"/>
               <w:rPr>
-                <w:rFonts w:asciiTheme="majorEastAsia" w:eastAsiaTheme="majorEastAsia" w:hAnsiTheme="majorEastAsia"/>
-              </w:rPr>
-            </w:pPr>
-            <w:r>
-              <w:rPr>
-                <w:rFonts w:asciiTheme="majorEastAsia" w:eastAsiaTheme="majorEastAsia" w:hAnsiTheme="majorEastAsia"/>
+                <w:rFonts w:asciiTheme="majorHAnsi" w:eastAsiaTheme="majorHAnsi" w:hAnsiTheme="majorHAnsi" w:hint="eastAsia"/>
+              </w:rPr>
+            </w:pPr>
+            <w:r>
+              <w:rPr>
+                <w:rFonts w:asciiTheme="majorHAnsi" w:eastAsiaTheme="majorHAnsi" w:hAnsiTheme="majorHAnsi"/>
               </w:rPr>
               <w:t>(    )kW  (    )기  케이블 (    )개</w:t>
             </w:r>
@@ -17437,7 +17372,7 @@
                 <w:b/>
                 <w:bCs/>
               </w:rPr>
-              <w:t>(보조금을 받은 충전시설에 한함)</w:t>
+              <w:t/>
             </w:r>
           </w:p>
         </w:tc>

</xml_diff>

<commit_message>
Fix broken 별지5호 table layout in nice/sk/pluglink
The prior commit spliced HEC's 6-span rows into 별지5호 tables whose
native grid differs (nice/sk=9, pluglink=11), breaking the table frame.
Rebuild regionA (희망수량) + 활동내용 rows natively per template so every
row's gridSpan sums to the table's own base, with valid vMerge chains.
7~11kW value SDT unified to 390864121 (matches schema); 11~30kW static blank.
별지7호(regionB, all 9-span) and 6번 title were already correct — unchanged.

Co-Authored-By: Claude Opus 4.8 (1M context) <noreply@anthropic.com>
</commit_message>
<xml_diff>
--- a/public/nice/template.docx
+++ b/public/nice/template.docx
@@ -10711,28 +10711,28 @@
         </w:trPr>
         <w:tc>
           <w:tcPr>
-            <w:tcW w:w="1553" w:type="dxa"/>
-            <w:vMerge/>
-            <w:vAlign w:val="center"/>
-          </w:tcPr>
-          <w:p>
-            <w:pPr>
-              <w:jc w:val="center"/>
-              <w:rPr>
-                <w:sz w:val="18"/>
-                <w:szCs w:val="18"/>
-              </w:rPr>
-            </w:pPr>
-          </w:p>
-        </w:tc>
-        <w:tc>
-          <w:tcPr>
             <w:tcW w:w="1554" w:type="dxa"/>
             <w:vMerge/>
             <w:vAlign w:val="center"/>
           </w:tcPr>
           <w:p>
             <w:pPr>
+              <w:jc w:val="center"/>
+              <w:rPr>
+                <w:sz w:val="18"/>
+                <w:szCs w:val="18"/>
+              </w:rPr>
+            </w:pPr>
+          </w:p>
+        </w:tc>
+        <w:tc>
+          <w:tcPr>
+            <w:tcW w:w="1555" w:type="dxa"/>
+            <w:vMerge/>
+            <w:vAlign w:val="center"/>
+          </w:tcPr>
+          <w:p>
+            <w:pPr>
               <w:jc w:val="both"/>
               <w:rPr>
                 <w:sz w:val="18"/>
@@ -10760,37 +10760,61 @@
         <w:tc>
           <w:tcPr>
             <w:tcW w:w="1704" w:type="dxa"/>
+            <w:gridSpan w:val="3"/>
             <w:vAlign w:val="center"/>
           </w:tcPr>
           <w:p>
             <w:pPr>
               <w:jc w:val="center"/>
               <w:rPr>
-                <w:rStyle w:val="9pt"/>
-              </w:rPr>
-            </w:pPr>
-            <w:r>
-              <w:rPr>
-                <w:rStyle w:val="9pt"/>
+                <w:sz w:val="18"/>
+                <w:szCs w:val="18"/>
+              </w:rPr>
+            </w:pPr>
+            <w:r>
+              <w:rPr>
                 <w:rFonts w:hint="eastAsia"/>
-              </w:rPr>
-              <w:t>활동내용</w:t>
-            </w:r>
-          </w:p>
-        </w:tc>
-        <w:tc>
-          <w:tcPr>
-            <w:tcW w:w="3798" w:type="dxa"/>
-            <w:gridSpan w:val="2"/>
+                <w:sz w:val="18"/>
+                <w:szCs w:val="18"/>
+              </w:rPr>
+              <w:t xml:space="preserve">활동내용</w:t>
+            </w:r>
+          </w:p>
+        </w:tc>
+        <w:tc>
+          <w:tcPr>
+            <w:tcW w:w="1867" w:type="dxa"/>
+            <w:gridSpan w:val="3"/>
             <w:vAlign w:val="center"/>
           </w:tcPr>
           <w:p>
             <w:pPr>
               <w:jc w:val="center"/>
               <w:rPr>
-                <w:rStyle w:val="9pt"/>
-              </w:rPr>
-            </w:pPr>
+                <w:b/>
+                <w:bCs/>
+                <w:i/>
+                <w:iCs/>
+                <w:sz w:val="18"/>
+                <w:szCs w:val="18"/>
+                <w:u w:val="single"/>
+              </w:rPr>
+            </w:pPr>
+            <w:r>
+              <w:rPr>
+                <w:rStyle w:val="a6"/>
+                <w:rFonts w:hint="eastAsia"/>
+                <w:b/>
+                <w:bCs/>
+                <w:i/>
+                <w:iCs/>
+                <w:color w:val="A6A6A6" w:themeColor="background1" w:themeShade="A6"/>
+                <w:sz w:val="18"/>
+                <w:szCs w:val="18"/>
+                <w:u w:val="single"/>
+              </w:rPr>
+              <w:t xml:space="preserve"/>
+            </w:r>
           </w:p>
         </w:tc>
       </w:tr>
@@ -11497,50 +11521,6 @@
         </w:tc>
       </w:tr>
       <w:tr>
-        <w:trPr>
-          <w:trHeight w:val="461"/>
-        </w:trPr>
-        <w:tc>
-          <w:tcPr>
-            <w:tcW w:w="1553" w:type="dxa"/>
-            <w:vMerge w:val="restart"/>
-            <w:vAlign w:val="center"/>
-          </w:tcPr>
-          <w:p>
-            <w:pPr>
-              <w:jc w:val="center"/>
-              <w:rPr>
-                <w:sz w:val="18"/>
-                <w:szCs w:val="18"/>
-              </w:rPr>
-            </w:pPr>
-            <w:r>
-              <w:rPr>
-                <w:rFonts w:hint="eastAsia"/>
-                <w:sz w:val="18"/>
-                <w:szCs w:val="18"/>
-              </w:rPr>
-              <w:t>설치수량</w:t>
-            </w:r>
-          </w:p>
-          <w:p>
-            <w:pPr>
-              <w:jc w:val="center"/>
-              <w:rPr>
-                <w:sz w:val="18"/>
-                <w:szCs w:val="18"/>
-              </w:rPr>
-            </w:pPr>
-            <w:r>
-              <w:rPr>
-                <w:rFonts w:hint="eastAsia"/>
-                <w:sz w:val="18"/>
-                <w:szCs w:val="18"/>
-              </w:rPr>
-              <w:t>및 요금</w:t>
-            </w:r>
-          </w:p>
-        </w:tc>
         <w:tc>
           <w:tcPr>
             <w:tcW w:w="1554" w:type="dxa"/>
@@ -11561,14 +11541,55 @@
                 <w:sz w:val="18"/>
                 <w:szCs w:val="18"/>
               </w:rPr>
+              <w:t>설치수량</w:t>
+            </w:r>
+          </w:p>
+          <w:p>
+            <w:pPr>
+              <w:jc w:val="center"/>
+              <w:rPr>
+                <w:sz w:val="18"/>
+                <w:szCs w:val="18"/>
+              </w:rPr>
+            </w:pPr>
+            <w:r>
+              <w:rPr>
+                <w:rFonts w:hint="eastAsia"/>
+                <w:sz w:val="18"/>
+                <w:szCs w:val="18"/>
+              </w:rPr>
+              <w:t>및 요금</w:t>
+            </w:r>
+          </w:p>
+        </w:tc>
+        <w:tc>
+          <w:tcPr>
+            <w:tcW w:w="1555" w:type="dxa"/>
+            <w:vMerge w:val="restart"/>
+            <w:vAlign w:val="center"/>
+          </w:tcPr>
+          <w:p>
+            <w:pPr>
+              <w:jc w:val="center"/>
+              <w:rPr>
+                <w:sz w:val="18"/>
+                <w:szCs w:val="18"/>
+              </w:rPr>
+            </w:pPr>
+            <w:r>
+              <w:rPr>
+                <w:rFonts w:hint="eastAsia"/>
+                <w:sz w:val="18"/>
+                <w:szCs w:val="18"/>
+              </w:rPr>
               <w:t>희망수량</w:t>
             </w:r>
           </w:p>
         </w:tc>
         <w:tc>
           <w:tcPr>
-            <w:tcW w:w="3551" w:type="dxa"/>
-            <w:gridSpan w:val="2"/>
+            <w:tcW w:w="1928" w:type="dxa"/>
+            <w:gridSpan w:val="4"/>
             <w:vAlign w:val="center"/>
           </w:tcPr>
           <w:p>
@@ -11586,36 +11607,37 @@
                 <w:sz w:val="18"/>
                 <w:szCs w:val="18"/>
               </w:rPr>
-              <w:t>7kW 이상 ~</w:t>
-            </w:r>
-            <w:r>
-              <w:rPr>
-                <w:rFonts w:hint="eastAsia"/>
-                <w:sz w:val="18"/>
-                <w:szCs w:val="18"/>
-              </w:rPr>
-              <w:t xml:space="preserve"> </w:t>
-            </w:r>
-            <w:r>
-              <w:rPr>
-                <w:rFonts w:hint="eastAsia"/>
-                <w:sz w:val="18"/>
-                <w:szCs w:val="18"/>
-              </w:rPr>
-              <w:t>11kW 미만</w:t>
-            </w:r>
-          </w:p>
-        </w:tc>
-        <w:tc>
-          <w:tcPr>
-            <w:tcW w:w="3798" w:type="dxa"/>
-            <w:gridSpan w:val="2"/>
-            <w:vAlign w:val="center"/>
-          </w:tcPr>
+              <w:t xml:space="preserve">7kW 이상 ~ 11kW 미만</w:t>
+            </w:r>
+          </w:p>
           <w:p>
             <w:pPr>
               <w:spacing w:line="180" w:lineRule="auto"/>
               <w:jc w:val="center"/>
+              <w:rPr>
+                <w:sz w:val="18"/>
+                <w:szCs w:val="18"/>
+              </w:rPr>
+            </w:pPr>
+            <w:r>
+              <w:rPr>
+                <w:rFonts w:hint="eastAsia"/>
+                <w:sz w:val="18"/>
+                <w:szCs w:val="18"/>
+              </w:rPr>
+              <w:t/>
+            </w:r>
+          </w:p>
+        </w:tc>
+        <w:tc>
+          <w:tcPr>
+            <w:tcW w:w="1928" w:type="dxa"/>
+            <w:gridSpan w:val="3"/>
+            <w:vAlign w:val="center"/>
+          </w:tcPr>
+          <w:p>
+            <w:pPr>
+              <w:jc w:val="right"/>
               <w:rPr>
                 <w:sz w:val="18"/>
                 <w:szCs w:val="18"/>
@@ -11629,7 +11651,7 @@
                 </w:rPr>
                 <w:id w:val="390864121"/>
                 <w:placeholder>
-                  <w:docPart w:val="326D145E8DA867418952807BC9540AFC"/>
+                  <w:docPart w:val="351CAB3454262F46A4936CD891704151"/>
                 </w:placeholder>
                 <w:showingPlcHdr/>
                 <w:text/>
@@ -11672,31 +11694,12 @@
                 <w:sz w:val="18"/>
                 <w:szCs w:val="18"/>
               </w:rPr>
-              <w:t xml:space="preserve"> 기</w:t>
+              <w:t xml:space="preserve"> 기 </w:t>
             </w:r>
           </w:p>
         </w:tc>
       </w:tr>
       <w:tr>
-        <w:trPr>
-          <w:trHeight w:val="349"/>
-        </w:trPr>
-        <w:tc>
-          <w:tcPr>
-            <w:tcW w:w="1553" w:type="dxa"/>
-            <w:vMerge/>
-            <w:vAlign w:val="center"/>
-          </w:tcPr>
-          <w:p>
-            <w:pPr>
-              <w:jc w:val="center"/>
-              <w:rPr>
-                <w:sz w:val="18"/>
-                <w:szCs w:val="18"/>
-              </w:rPr>
-            </w:pPr>
-          </w:p>
-        </w:tc>
         <w:tc>
           <w:tcPr>
             <w:tcW w:w="1554" w:type="dxa"/>
@@ -11715,8 +11718,24 @@
         </w:tc>
         <w:tc>
           <w:tcPr>
-            <w:tcW w:w="3551" w:type="dxa"/>
-            <w:gridSpan w:val="2"/>
+            <w:tcW w:w="1555" w:type="dxa"/>
+            <w:vMerge/>
+            <w:vAlign w:val="center"/>
+          </w:tcPr>
+          <w:p>
+            <w:pPr>
+              <w:jc w:val="center"/>
+              <w:rPr>
+                <w:sz w:val="18"/>
+                <w:szCs w:val="18"/>
+              </w:rPr>
+            </w:pPr>
+          </w:p>
+        </w:tc>
+        <w:tc>
+          <w:tcPr>
+            <w:tcW w:w="1928" w:type="dxa"/>
+            <w:gridSpan w:val="4"/>
             <w:vAlign w:val="center"/>
           </w:tcPr>
           <w:p>
@@ -11734,119 +11753,54 @@
                 <w:sz w:val="18"/>
                 <w:szCs w:val="18"/>
               </w:rPr>
-              <w:t>11kW 이상 ~</w:t>
-            </w:r>
+              <w:t xml:space="preserve">11kW 이상 ~ 30kW 미만</w:t>
+            </w:r>
+          </w:p>
+          <w:p>
+            <w:pPr>
+              <w:spacing w:line="180" w:lineRule="auto"/>
+              <w:jc w:val="center"/>
+              <w:rPr>
+                <w:sz w:val="18"/>
+                <w:szCs w:val="18"/>
+              </w:rPr>
+            </w:pPr>
             <w:r>
               <w:rPr>
                 <w:rFonts w:hint="eastAsia"/>
                 <w:sz w:val="18"/>
                 <w:szCs w:val="18"/>
               </w:rPr>
-              <w:t xml:space="preserve"> </w:t>
-            </w:r>
+              <w:t/>
+            </w:r>
+          </w:p>
+        </w:tc>
+        <w:tc>
+          <w:tcPr>
+            <w:gridSpan w:val="3"/>
+            <w:tcW w:w="1929" w:type="dxa"/>
+            <w:vAlign w:val="center"/>
+          </w:tcPr>
+          <w:p>
+            <w:pPr>
+              <w:jc w:val="right"/>
+              <w:rPr>
+                <w:sz w:val="18"/>
+                <w:szCs w:val="18"/>
+              </w:rPr>
+            </w:pPr>
             <w:r>
               <w:rPr>
                 <w:rFonts w:hint="eastAsia"/>
                 <w:sz w:val="18"/>
                 <w:szCs w:val="18"/>
               </w:rPr>
-              <w:t>30kW 미만</w:t>
-            </w:r>
-          </w:p>
-        </w:tc>
-        <w:bookmarkStart w:id="28" w:name="InstallQty2"/>
-        <w:bookmarkEnd w:id="28"/>
-        <w:tc>
-          <w:tcPr>
-            <w:tcW w:w="3798" w:type="dxa"/>
-            <w:gridSpan w:val="2"/>
-            <w:vAlign w:val="center"/>
-          </w:tcPr>
-          <w:p>
-            <w:pPr>
-              <w:jc w:val="center"/>
-              <w:rPr>
-                <w:rFonts w:hint="eastAsia"/>
-                <w:sz w:val="18"/>
-                <w:szCs w:val="18"/>
-              </w:rPr>
-            </w:pPr>
-            <w:sdt>
-              <w:sdtPr>
-                <w:rPr>
-                  <w:rStyle w:val="9pt"/>
-                  <w:rFonts w:hint="eastAsia"/>
-                </w:rPr>
-                <w:id w:val="1751003065"/>
-                <w:placeholder>
-                  <w:docPart w:val="7CF96C4D8F927649A96928F4DEE2EFB3"/>
-                </w:placeholder>
-                <w:showingPlcHdr/>
-                <w:text/>
-              </w:sdtPr>
-              <w:sdtEndPr>
-                <w:rPr>
-                  <w:rStyle w:val="a0"/>
-                  <w:rFonts w:eastAsia="맑은 고딕"/>
-                  <w:b w:val="0"/>
-                  <w:bCs/>
-                  <w:i/>
-                  <w:iCs/>
-                  <w:color w:val="A6A6A6" w:themeColor="background1" w:themeShade="A6"/>
-                  <w:sz w:val="16"/>
-                  <w:szCs w:val="16"/>
-                  <w:u w:val="single"/>
-                </w:rPr>
-              </w:sdtEndPr>
-              <w:sdtContent>
-                <w:r>
-                  <w:rPr>
-                    <w:rStyle w:val="a6"/>
-                    <w:rFonts w:hint="eastAsia"/>
-                    <w:b/>
-                    <w:bCs/>
-                    <w:i/>
-                    <w:iCs/>
-                    <w:color w:val="A6A6A6" w:themeColor="background1" w:themeShade="A6"/>
-                    <w:sz w:val="18"/>
-                    <w:szCs w:val="18"/>
-                    <w:u w:val="single"/>
-                  </w:rPr>
-                  <w:t xml:space="preserve">OO </w:t>
-                </w:r>
-              </w:sdtContent>
-            </w:sdt>
-            <w:r>
-              <w:rPr>
-                <w:rFonts w:hint="eastAsia"/>
-                <w:sz w:val="18"/>
-                <w:szCs w:val="18"/>
-              </w:rPr>
-              <w:t xml:space="preserve"> 기</w:t>
+              <w:t>기</w:t>
             </w:r>
           </w:p>
         </w:tc>
       </w:tr>
       <w:tr>
-        <w:trPr>
-          <w:trHeight w:val="413"/>
-        </w:trPr>
-        <w:tc>
-          <w:tcPr>
-            <w:tcW w:w="1553" w:type="dxa"/>
-            <w:vMerge/>
-            <w:vAlign w:val="center"/>
-          </w:tcPr>
-          <w:p>
-            <w:pPr>
-              <w:jc w:val="center"/>
-              <w:rPr>
-                <w:sz w:val="18"/>
-                <w:szCs w:val="18"/>
-              </w:rPr>
-            </w:pPr>
-          </w:p>
-        </w:tc>
         <w:tc>
           <w:tcPr>
             <w:tcW w:w="1554" w:type="dxa"/>
@@ -11865,8 +11819,8 @@
         </w:tc>
         <w:tc>
           <w:tcPr>
-            <w:tcW w:w="3551" w:type="dxa"/>
-            <w:gridSpan w:val="2"/>
+            <w:tcW w:w="1555" w:type="dxa"/>
+            <w:vMerge/>
             <w:vAlign w:val="center"/>
           </w:tcPr>
           <w:p>
@@ -11877,20 +11831,55 @@
                 <w:szCs w:val="18"/>
               </w:rPr>
             </w:pPr>
+          </w:p>
+        </w:tc>
+        <w:tc>
+          <w:tcPr>
+            <w:tcW w:w="1928" w:type="dxa"/>
+            <w:gridSpan w:val="4"/>
+            <w:vAlign w:val="center"/>
+          </w:tcPr>
+          <w:p>
+            <w:pPr>
+              <w:spacing w:line="180" w:lineRule="auto"/>
+              <w:jc w:val="center"/>
+              <w:rPr>
+                <w:sz w:val="18"/>
+                <w:szCs w:val="18"/>
+              </w:rPr>
+            </w:pPr>
             <w:r>
               <w:rPr>
                 <w:rFonts w:hint="eastAsia"/>
                 <w:sz w:val="18"/>
                 <w:szCs w:val="18"/>
               </w:rPr>
-              <w:t>전력분배형</w:t>
-            </w:r>
-          </w:p>
-        </w:tc>
-        <w:tc>
-          <w:tcPr>
-            <w:tcW w:w="3798" w:type="dxa"/>
-            <w:gridSpan w:val="2"/>
+              <w:t xml:space="preserve">전력분배형</w:t>
+            </w:r>
+          </w:p>
+          <w:p>
+            <w:pPr>
+              <w:spacing w:line="180" w:lineRule="auto"/>
+              <w:jc w:val="center"/>
+              <w:rPr>
+                <w:sz w:val="18"/>
+                <w:szCs w:val="18"/>
+              </w:rPr>
+            </w:pPr>
+            <w:r>
+              <w:rPr>
+                <w:rFonts w:hint="eastAsia"/>
+                <w:sz w:val="18"/>
+                <w:szCs w:val="18"/>
+              </w:rPr>
+              <w:t/>
+            </w:r>
+          </w:p>
+        </w:tc>
+        <w:tc>
+          <w:tcPr>
+            <w:tcW w:w="2449" w:type="dxa"/>
+            <w:gridSpan w:val="3"/>
             <w:vAlign w:val="center"/>
           </w:tcPr>
           <w:p>
@@ -11907,15 +11896,7 @@
                 <w:sz w:val="18"/>
                 <w:szCs w:val="18"/>
               </w:rPr>
-              <w:t>kW    기(케이블     개</w:t>
-            </w:r>
-            <w:r>
-              <w:rPr>
-                <w:rFonts w:hint="eastAsia"/>
-                <w:sz w:val="18"/>
-                <w:szCs w:val="18"/>
-              </w:rPr>
-              <w:t>)</w:t>
+              <w:t>kW    기(케이블     개)</w:t>
             </w:r>
           </w:p>
         </w:tc>

</xml_diff>

<commit_message>
Remove empty paragraph below 희망수량 labels in 별지5호 (nice/sk/pluglink)
The native regionA rebuild carried a trailing empty <w:p> in each kW-label
cell (7~11/11~30/전력분배형), rendering as a blank line under the label.
Strip it so each label cell holds a single paragraph, matching HEC.

Co-Authored-By: Claude Opus 4.8 (1M context) <noreply@anthropic.com>
</commit_message>
<xml_diff>
--- a/public/nice/template.docx
+++ b/public/nice/template.docx
@@ -11610,24 +11610,6 @@
               <w:t xml:space="preserve">7kW 이상 ~ 11kW 미만</w:t>
             </w:r>
           </w:p>
-          <w:p>
-            <w:pPr>
-              <w:spacing w:line="180" w:lineRule="auto"/>
-              <w:jc w:val="center"/>
-              <w:rPr>
-                <w:sz w:val="18"/>
-                <w:szCs w:val="18"/>
-              </w:rPr>
-            </w:pPr>
-            <w:r>
-              <w:rPr>
-                <w:rFonts w:hint="eastAsia"/>
-                <w:sz w:val="18"/>
-                <w:szCs w:val="18"/>
-              </w:rPr>
-              <w:t/>
-            </w:r>
-          </w:p>
         </w:tc>
         <w:tc>
           <w:tcPr>
@@ -11756,24 +11738,6 @@
               <w:t xml:space="preserve">11kW 이상 ~ 30kW 미만</w:t>
             </w:r>
           </w:p>
-          <w:p>
-            <w:pPr>
-              <w:spacing w:line="180" w:lineRule="auto"/>
-              <w:jc w:val="center"/>
-              <w:rPr>
-                <w:sz w:val="18"/>
-                <w:szCs w:val="18"/>
-              </w:rPr>
-            </w:pPr>
-            <w:r>
-              <w:rPr>
-                <w:rFonts w:hint="eastAsia"/>
-                <w:sz w:val="18"/>
-                <w:szCs w:val="18"/>
-              </w:rPr>
-              <w:t/>
-            </w:r>
-          </w:p>
         </w:tc>
         <w:tc>
           <w:tcPr>
@@ -11855,24 +11819,6 @@
                 <w:szCs w:val="18"/>
               </w:rPr>
               <w:t xml:space="preserve">전력분배형</w:t>
-            </w:r>
-          </w:p>
-          <w:p>
-            <w:pPr>
-              <w:spacing w:line="180" w:lineRule="auto"/>
-              <w:jc w:val="center"/>
-              <w:rPr>
-                <w:sz w:val="18"/>
-                <w:szCs w:val="18"/>
-              </w:rPr>
-            </w:pPr>
-            <w:r>
-              <w:rPr>
-                <w:rFonts w:hint="eastAsia"/>
-                <w:sz w:val="18"/>
-                <w:szCs w:val="18"/>
-              </w:rPr>
-              <w:t/>
             </w:r>
           </w:p>
         </w:tc>

</xml_diff>

<commit_message>
Convert SK/SK-invest/NICE fragile 1순위 fields to SDT content controls
취약 단일노드 텍스트 치환을 SDT(콘텐츠 컨트롤)로 전환해 run-split(proofErr) 버그를 근절.

- SK/SK-invest 계약서:
  - 계약기간 '□ 10년, □ 7년' → SDT 900000051 (buildSkSdtMaps에서 토글값 계산)
  - 계약일 날짜 → SDT 900000052
  - BAS1007.D1.1(항상 체크)은 템플릿에서 ■로 영구 수정 (SK는 3-run 분리로
    기존 전체문자열 규칙이 매칭 실패하던 잠재 버그였음)
  - buildSkTextReplacements / buildSkInvestTextReplacements → 빈 배열
- NICE 계약서:
  - 직인동의서 주소/대표자/날짜 → 기존 HEC seal SDT id(900000002/3/4) 재사용
  - 계약행(제1조 표) 수량/계약금액 → SDT 900000041/900000042 (인덱스 기반 제거)
  - buildNiceTextReplacements → 빈 배열, fillNiceContractRow 제거
  - '☐실외,지상' 오타는 템플릿에 이미 반영되어 죽은 규칙 삭제

Word→PDF 렌더로 3개 템플릿 모두 검증 완료.

Co-Authored-By: Claude Opus 4.8 (1M context) <noreply@anthropic.com>
</commit_message>
<xml_diff>
--- a/public/nice/template.docx
+++ b/public/nice/template.docx
@@ -1769,6 +1769,27 @@
                 <w:sz w:val="16"/>
               </w:rPr>
             </w:pPr>
+            <w:sdt>
+              <w:sdtPr>
+                <w:rPr>
+                  <w:sz w:val="16"/>
+                  <w:szCs w:val="16"/>
+                </w:rPr>
+                <w:alias w:val="계약-수량"/>
+                <w:tag w:val="niceContractQty"/>
+                <w:id w:val="900000041"/>
+                <w:text/>
+              </w:sdtPr>
+              <w:sdtContent>
+                <w:r>
+                  <w:rPr>
+                    <w:sz w:val="16"/>
+                    <w:szCs w:val="16"/>
+                  </w:rPr>
+                  <w:t xml:space="preserve"/>
+                </w:r>
+              </w:sdtContent>
+            </w:sdt>
           </w:p>
         </w:tc>
         <w:tc>
@@ -1808,6 +1829,27 @@
                 <w:sz w:val="16"/>
               </w:rPr>
             </w:pPr>
+            <w:sdt>
+              <w:sdtPr>
+                <w:rPr>
+                  <w:sz w:val="16"/>
+                  <w:szCs w:val="16"/>
+                </w:rPr>
+                <w:alias w:val="계약-금액"/>
+                <w:tag w:val="niceContractAmount"/>
+                <w:id w:val="900000042"/>
+                <w:text/>
+              </w:sdtPr>
+              <w:sdtContent>
+                <w:r>
+                  <w:rPr>
+                    <w:sz w:val="16"/>
+                    <w:szCs w:val="16"/>
+                  </w:rPr>
+                  <w:t xml:space="preserve"/>
+                </w:r>
+              </w:sdtContent>
+            </w:sdt>
           </w:p>
         </w:tc>
         <w:tc>
@@ -12485,16 +12527,54 @@
         <w:rPr>
           <w:rFonts w:hint="eastAsia"/>
         </w:rPr>
-        <w:t>주소: 광주광역시 북구 대자실로 22</w:t>
+        <w:t xml:space="preserve">주소: </w:t>
       </w:r>
+      <w:sdt>
+        <w:sdtPr>
+          <w:rPr>
+            <w:rFonts w:hint="eastAsia"/>
+          </w:rPr>
+          <w:alias w:val="직인-주소"/>
+          <w:tag w:val="sealAddr"/>
+          <w:id w:val="900000002"/>
+          <w:text/>
+        </w:sdtPr>
+        <w:sdtContent>
+          <w:r>
+            <w:rPr>
+              <w:rFonts w:hint="eastAsia"/>
+            </w:rPr>
+            <w:t xml:space="preserve">광주광역시 북구 대자실로 22</w:t>
+          </w:r>
+        </w:sdtContent>
+      </w:sdt>
     </w:p>
     <w:p>
       <w:r>
         <w:rPr>
           <w:rFonts w:hint="eastAsia"/>
         </w:rPr>
-        <w:t>대표자: 이명주</w:t>
+        <w:t xml:space="preserve">대표자: </w:t>
       </w:r>
+      <w:sdt>
+        <w:sdtPr>
+          <w:rPr>
+            <w:rFonts w:hint="eastAsia"/>
+          </w:rPr>
+          <w:alias w:val="직인-대표자"/>
+          <w:tag w:val="sealRep"/>
+          <w:id w:val="900000003"/>
+          <w:text/>
+        </w:sdtPr>
+        <w:sdtContent>
+          <w:r>
+            <w:rPr>
+              <w:rFonts w:hint="eastAsia"/>
+            </w:rPr>
+            <w:t xml:space="preserve">이명주</w:t>
+          </w:r>
+        </w:sdtContent>
+      </w:sdt>
     </w:p>
     <w:p/>
     <w:tbl>
@@ -12794,14 +12874,29 @@
           <w:bCs/>
         </w:rPr>
       </w:pPr>
-      <w:r>
-        <w:rPr>
-          <w:rFonts w:hint="eastAsia"/>
-          <w:b/>
-          <w:bCs/>
-        </w:rPr>
-        <w:t>2025년 9월 25일</w:t>
-      </w:r>
+      <w:sdt>
+        <w:sdtPr>
+          <w:rPr>
+            <w:rFonts w:hint="eastAsia"/>
+            <w:b/>
+            <w:bCs/>
+          </w:rPr>
+          <w:alias w:val="직인-날짜"/>
+          <w:tag w:val="sealDate"/>
+          <w:id w:val="900000004"/>
+          <w:text/>
+        </w:sdtPr>
+        <w:sdtContent>
+          <w:r>
+            <w:rPr>
+              <w:rFonts w:hint="eastAsia"/>
+              <w:b/>
+              <w:bCs/>
+            </w:rPr>
+            <w:t>2025년 9월 25일</w:t>
+          </w:r>
+        </w:sdtContent>
+      </w:sdt>
     </w:p>
     <w:p>
       <w:pPr>

</xml_diff>

<commit_message>
Convert curated 2순위 paragraph fields to SDT (NICE 설치위치·직인상호·제3조, SK/SKi 서명란)
문단 전체일치 치환 중 단일 출현·가치 높은 항목만 SDT로 전환.

- NICE:
  - 설치위치(제1조 표) → SDT 900000043 (buildNiceInstallLocation)
  - 제3조 계약기간 인라인 체크박스 → SDT 900000048 (fillNiceContractTerm 제거)
  - 직인동의서 상호 → 기존 sealSangho id(900000001) 재사용
    → 직인동의서 상호·주소·대표자·날짜가 이제 전부 SDT
- SK/SK-invest:
  - 서비스이용자 서명란 → SDT 900000053 (padding 포함, 필러 문단매칭 제거)

보류(문단치환 유지): NICE 서명부(계약체결일·7일·고객사명·신청자)는 문서 내
2~4벌 중복이라 SDT마다 고유 id가 필요하고, 대상이 교체 전용 더미데이터라
편집 취약성이 낮음. 기존 문단치환은 run-split 내성이 있어 그대로 둠.

Word→PDF 렌더로 3개 템플릿 검증 완료.

Co-Authored-By: Claude Opus 4.8 (1M context) <noreply@anthropic.com>
</commit_message>
<xml_diff>
--- a/public/nice/template.docx
+++ b/public/nice/template.docx
@@ -1927,117 +1927,130 @@
                 <w:sz w:val="16"/>
               </w:rPr>
             </w:pPr>
-            <w:r>
-              <w:rPr>
-                <w:sz w:val="16"/>
-              </w:rPr>
-              <w:t>부산광역시</w:t>
-            </w:r>
-            <w:r>
-              <w:rPr>
-                <w:spacing w:val="-4"/>
-                <w:sz w:val="16"/>
-              </w:rPr>
-              <w:t xml:space="preserve"> </w:t>
-            </w:r>
-            <w:r>
-              <w:rPr>
-                <w:sz w:val="16"/>
-              </w:rPr>
-              <w:t>연제구</w:t>
-            </w:r>
-            <w:r>
-              <w:rPr>
-                <w:spacing w:val="-2"/>
-                <w:sz w:val="16"/>
-              </w:rPr>
-              <w:t xml:space="preserve"> </w:t>
-            </w:r>
-            <w:r>
-              <w:rPr>
-                <w:sz w:val="16"/>
-              </w:rPr>
-              <w:t>거제대로</w:t>
-            </w:r>
-            <w:r>
-              <w:rPr>
-                <w:spacing w:val="-2"/>
-                <w:sz w:val="16"/>
-              </w:rPr>
-              <w:t xml:space="preserve"> </w:t>
-            </w:r>
-            <w:r>
-              <w:rPr>
-                <w:sz w:val="16"/>
-              </w:rPr>
-              <w:t>275</w:t>
-            </w:r>
-            <w:r>
-              <w:rPr>
-                <w:rFonts w:hint="eastAsia"/>
-                <w:sz w:val="16"/>
-              </w:rPr>
-              <w:t xml:space="preserve"> / 상세위치 : </w:t>
-            </w:r>
-            <w:r>
-              <w:rPr>
-                <w:sz w:val="16"/>
-              </w:rPr>
-              <w:t>지하</w:t>
-            </w:r>
-            <w:r>
-              <w:rPr>
-                <w:spacing w:val="-2"/>
-                <w:sz w:val="16"/>
-              </w:rPr>
-              <w:t xml:space="preserve"> </w:t>
-            </w:r>
-            <w:r>
-              <w:rPr>
-                <w:sz w:val="16"/>
-              </w:rPr>
-              <w:t>1층</w:t>
-            </w:r>
-            <w:r>
-              <w:rPr>
-                <w:spacing w:val="-2"/>
-                <w:sz w:val="16"/>
-              </w:rPr>
-              <w:t xml:space="preserve"> </w:t>
-            </w:r>
-            <w:r>
-              <w:rPr>
-                <w:sz w:val="16"/>
-              </w:rPr>
-              <w:t>06,12</w:t>
-            </w:r>
-            <w:r>
-              <w:rPr>
-                <w:spacing w:val="-3"/>
-                <w:sz w:val="16"/>
-              </w:rPr>
-              <w:t xml:space="preserve"> </w:t>
-            </w:r>
-            <w:r>
-              <w:rPr>
-                <w:sz w:val="16"/>
-              </w:rPr>
-              <w:t>기둥</w:t>
-            </w:r>
-            <w:r>
-              <w:rPr>
-                <w:spacing w:val="-1"/>
-                <w:sz w:val="16"/>
-              </w:rPr>
-              <w:t xml:space="preserve"> </w:t>
-            </w:r>
-            <w:r>
-              <w:rPr>
-                <w:spacing w:val="-10"/>
-                <w:sz w:val="16"/>
-              </w:rPr>
-              <w:t>옆</w:t>
-            </w:r>
+            <w:sdt>
+              <w:sdtPr>
+                <w:rPr>
+                  <w:sz w:val="16"/>
+                </w:rPr>
+                <w:alias w:val="설치위치"/>
+                <w:tag w:val="niceInstallLoc"/>
+                <w:id w:val="900000043"/>
+                <w:text/>
+              </w:sdtPr>
+              <w:sdtContent>
+                <w:r>
+                  <w:rPr>
+                    <w:sz w:val="16"/>
+                  </w:rPr>
+                  <w:t>부산광역시</w:t>
+                </w:r>
+                <w:r>
+                  <w:rPr>
+                    <w:spacing w:val="-4"/>
+                    <w:sz w:val="16"/>
+                  </w:rPr>
+                  <w:t xml:space="preserve"> </w:t>
+                </w:r>
+                <w:r>
+                  <w:rPr>
+                    <w:sz w:val="16"/>
+                  </w:rPr>
+                  <w:t>연제구</w:t>
+                </w:r>
+                <w:r>
+                  <w:rPr>
+                    <w:spacing w:val="-2"/>
+                    <w:sz w:val="16"/>
+                  </w:rPr>
+                  <w:t xml:space="preserve"> </w:t>
+                </w:r>
+                <w:r>
+                  <w:rPr>
+                    <w:sz w:val="16"/>
+                  </w:rPr>
+                  <w:t>거제대로</w:t>
+                </w:r>
+                <w:r>
+                  <w:rPr>
+                    <w:spacing w:val="-2"/>
+                    <w:sz w:val="16"/>
+                  </w:rPr>
+                  <w:t xml:space="preserve"> </w:t>
+                </w:r>
+                <w:r>
+                  <w:rPr>
+                    <w:sz w:val="16"/>
+                  </w:rPr>
+                  <w:t>275</w:t>
+                </w:r>
+                <w:r>
+                  <w:rPr>
+                    <w:rFonts w:hint="eastAsia"/>
+                    <w:sz w:val="16"/>
+                  </w:rPr>
+                  <w:t xml:space="preserve"> / 상세위치 : </w:t>
+                </w:r>
+                <w:r>
+                  <w:rPr>
+                    <w:sz w:val="16"/>
+                  </w:rPr>
+                  <w:t>지하</w:t>
+                </w:r>
+                <w:r>
+                  <w:rPr>
+                    <w:spacing w:val="-2"/>
+                    <w:sz w:val="16"/>
+                  </w:rPr>
+                  <w:t xml:space="preserve"> </w:t>
+                </w:r>
+                <w:r>
+                  <w:rPr>
+                    <w:sz w:val="16"/>
+                  </w:rPr>
+                  <w:t>1층</w:t>
+                </w:r>
+                <w:r>
+                  <w:rPr>
+                    <w:spacing w:val="-2"/>
+                    <w:sz w:val="16"/>
+                  </w:rPr>
+                  <w:t xml:space="preserve"> </w:t>
+                </w:r>
+                <w:r>
+                  <w:rPr>
+                    <w:sz w:val="16"/>
+                  </w:rPr>
+                  <w:t>06,12</w:t>
+                </w:r>
+                <w:r>
+                  <w:rPr>
+                    <w:spacing w:val="-3"/>
+                    <w:sz w:val="16"/>
+                  </w:rPr>
+                  <w:t xml:space="preserve"> </w:t>
+                </w:r>
+                <w:r>
+                  <w:rPr>
+                    <w:sz w:val="16"/>
+                  </w:rPr>
+                  <w:t>기둥</w:t>
+                </w:r>
+                <w:r>
+                  <w:rPr>
+                    <w:spacing w:val="-1"/>
+                    <w:sz w:val="16"/>
+                  </w:rPr>
+                  <w:t xml:space="preserve"> </w:t>
+                </w:r>
+                <w:r>
+                  <w:rPr>
+                    <w:spacing w:val="-10"/>
+                    <w:sz w:val="16"/>
+                  </w:rPr>
+                  <w:t>옆</w:t>
+                </w:r>
+              </w:sdtContent>
+            </w:sdt>
           </w:p>
         </w:tc>
       </w:tr>
@@ -2428,54 +2441,68 @@
               </w:rPr>
               <w:t xml:space="preserve">  </w:t>
             </w:r>
-            <w:r>
-              <w:rPr>
-                <w:rFonts w:ascii="Segoe UI Symbol" w:eastAsia="Segoe UI Symbol" w:hAnsi="Segoe UI Symbol"/>
-                <w:sz w:val="16"/>
-              </w:rPr>
-              <w:t>☐</w:t>
-            </w:r>
-            <w:r>
-              <w:rPr>
-                <w:rFonts w:ascii="Segoe UI Symbol" w:eastAsia="Segoe UI Symbol" w:hAnsi="Segoe UI Symbol"/>
-                <w:spacing w:val="13"/>
-                <w:sz w:val="16"/>
-              </w:rPr>
-              <w:t xml:space="preserve"> </w:t>
-            </w:r>
-            <w:r>
-              <w:rPr>
-                <w:sz w:val="16"/>
-              </w:rPr>
-              <w:t>7년(84개월)</w:t>
-            </w:r>
-            <w:r>
-              <w:rPr>
-                <w:spacing w:val="-3"/>
-                <w:sz w:val="16"/>
-              </w:rPr>
-              <w:t xml:space="preserve"> </w:t>
-            </w:r>
-            <w:r>
-              <w:rPr>
-                <w:sz w:val="16"/>
-              </w:rPr>
-              <w:t>■</w:t>
-            </w:r>
-            <w:r>
-              <w:rPr>
-                <w:spacing w:val="1"/>
-                <w:sz w:val="16"/>
-              </w:rPr>
-              <w:t xml:space="preserve"> </w:t>
-            </w:r>
-            <w:r>
-              <w:rPr>
-                <w:spacing w:val="-2"/>
-                <w:sz w:val="16"/>
-              </w:rPr>
-              <w:t>10년(120개월)</w:t>
-            </w:r>
+            <w:sdt>
+              <w:sdtPr>
+                <w:rPr>
+                  <w:rFonts w:ascii="Segoe UI Symbol" w:eastAsia="Segoe UI Symbol" w:hAnsi="Segoe UI Symbol"/>
+                  <w:sz w:val="16"/>
+                </w:rPr>
+                <w:alias w:val="제3조-계약기간"/>
+                <w:tag w:val="niceContractTermInline"/>
+                <w:id w:val="900000048"/>
+                <w:text/>
+              </w:sdtPr>
+              <w:sdtContent>
+                <w:r>
+                  <w:rPr>
+                    <w:rFonts w:ascii="Segoe UI Symbol" w:eastAsia="Segoe UI Symbol" w:hAnsi="Segoe UI Symbol"/>
+                    <w:sz w:val="16"/>
+                  </w:rPr>
+                  <w:t>☐</w:t>
+                </w:r>
+                <w:r>
+                  <w:rPr>
+                    <w:rFonts w:ascii="Segoe UI Symbol" w:eastAsia="Segoe UI Symbol" w:hAnsi="Segoe UI Symbol"/>
+                    <w:spacing w:val="13"/>
+                    <w:sz w:val="16"/>
+                  </w:rPr>
+                  <w:t xml:space="preserve"> </w:t>
+                </w:r>
+                <w:r>
+                  <w:rPr>
+                    <w:sz w:val="16"/>
+                  </w:rPr>
+                  <w:t>7년(84개월)</w:t>
+                </w:r>
+                <w:r>
+                  <w:rPr>
+                    <w:spacing w:val="-3"/>
+                    <w:sz w:val="16"/>
+                  </w:rPr>
+                  <w:t xml:space="preserve"> </w:t>
+                </w:r>
+                <w:r>
+                  <w:rPr>
+                    <w:sz w:val="16"/>
+                  </w:rPr>
+                  <w:t>■</w:t>
+                </w:r>
+                <w:r>
+                  <w:rPr>
+                    <w:spacing w:val="1"/>
+                    <w:sz w:val="16"/>
+                  </w:rPr>
+                  <w:t xml:space="preserve"> </w:t>
+                </w:r>
+                <w:r>
+                  <w:rPr>
+                    <w:spacing w:val="-2"/>
+                    <w:sz w:val="16"/>
+                  </w:rPr>
+                  <w:t>10년(120개월)</w:t>
+                </w:r>
+              </w:sdtContent>
+            </w:sdt>
           </w:p>
         </w:tc>
       </w:tr>
@@ -12508,19 +12535,32 @@
         <w:t xml:space="preserve">상호: </w:t>
       </w:r>
       <w:proofErr w:type="spellStart"/>
-      <w:r>
-        <w:rPr>
-          <w:rFonts w:hint="eastAsia"/>
-        </w:rPr>
-        <w:t>운암포레스힐</w:t>
-      </w:r>
-      <w:proofErr w:type="spellEnd"/>
-      <w:r>
-        <w:rPr>
-          <w:rFonts w:hint="eastAsia"/>
-        </w:rPr>
-        <w:t>2 관리사무소</w:t>
-      </w:r>
+      <w:sdt>
+        <w:sdtPr>
+          <w:rPr>
+            <w:rFonts w:hint="eastAsia"/>
+          </w:rPr>
+          <w:alias w:val="직인-상호"/>
+          <w:tag w:val="sealSangho"/>
+          <w:id w:val="900000001"/>
+          <w:text/>
+        </w:sdtPr>
+        <w:sdtContent>
+          <w:r>
+            <w:rPr>
+              <w:rFonts w:hint="eastAsia"/>
+            </w:rPr>
+            <w:t>운암포레스힐</w:t>
+          </w:r>
+          <w:proofErr w:type="spellEnd"/>
+          <w:r>
+            <w:rPr>
+              <w:rFonts w:hint="eastAsia"/>
+            </w:rPr>
+            <w:t>2 관리사무소</w:t>
+          </w:r>
+        </w:sdtContent>
+      </w:sdt>
     </w:p>
     <w:p>
       <w:r>

</xml_diff>